<commit_message>
docs: Middle East cross-geo DR to Europe (v2.4 amended)
Middle East now offers DR: Prod+CVAL co-locate in a weighted-selected
Middle East Standard region; DR placed cross-geo in a weighted-selected
Europe Standard region. Adds third distribution model (cross-geo DR)
alongside US 3-region and 2-region co-located models.

New codes: DR-020 (cross-geo DR ME->Europe), PLC-010b (cross-geo override
to PLC-010a), A-ME1 (data-residency assumption). DEC-001 marked RESOLVED.

Scope: baseline v2.4, ADR-001/003/005/007 + README, FDD/TDD/UML,
diagrams (T17, F4), reference material, backlog, READMEs, and POC suite
(config.py, preflight.py, g9 tests, region/model tests, workbook,
config template). Tests: 20 pytest + 15 region + 48 v24 assertions pass.
</commit_message>
<xml_diff>
--- a/Architecture/adr/acrme_adr_001_region_selection.docx
+++ b/Architecture/adr/acrme_adr_001_region_selection.docx
@@ -175,7 +175,7 @@
           <w:bCs/>
           <w:b/>
         </w:rPr>
-        <w:t xml:space="preserve">v2.4 reconciliation note — no region-model change.</w:t>
+        <w:t xml:space="preserve">v2.4 reconciliation note — reservation-model gaps.</w:t>
       </w:r>
       <w:r>
         <w:t xml:space="preserve"> </w:t>
@@ -225,7 +225,44 @@
         <w:t xml:space="preserve">CustomerSeedRecord</w:t>
       </w:r>
       <w:r>
-        <w:t xml:space="preserve">, two-region CVAL/DR co-location (PLC-010a) and the Middle East</w:t>
+        <w:t xml:space="preserve"> </w:t>
+      </w:r>
+      <w:r>
+        <w:t xml:space="preserve">and two-region CVAL/DR co-location (PLC-010a) are all unchanged by the reservation-model work. The new per-AZ CRG structure (CAP-023) operates</w:t>
+      </w:r>
+      <w:r>
+        <w:t xml:space="preserve"> </w:t>
+      </w:r>
+      <w:r>
+        <w:rPr>
+          <w:bCs/>
+          <w:b/>
+        </w:rPr>
+        <w:t xml:space="preserve">within</w:t>
+      </w:r>
+      <w:r>
+        <w:t xml:space="preserve"> </w:t>
+      </w:r>
+      <w:r>
+        <w:t xml:space="preserve">a selected region and is specified in ADR-002/ADR-004, not here.</w:t>
+      </w:r>
+    </w:p>
+    <w:p>
+      <w:pPr>
+        <w:pStyle w:val="BlockText"/>
+      </w:pPr>
+      <w:r>
+        <w:rPr>
+          <w:bCs/>
+          <w:b/>
+        </w:rPr>
+        <w:t xml:space="preserve">v2.4 (amended) note — Middle East DR now offered (cross-geo to Europe).</w:t>
+      </w:r>
+      <w:r>
+        <w:t xml:space="preserve"> </w:t>
+      </w:r>
+      <w:r>
+        <w:t xml:space="preserve">As of the 11 Sep 2026 amendment to baseline v2.4, the Middle East</w:t>
       </w:r>
       <w:r>
         <w:t xml:space="preserve"> </w:t>
@@ -240,7 +277,158 @@
         <w:t xml:space="preserve"> </w:t>
       </w:r>
       <w:r>
-        <w:t xml:space="preserve">position (DEC-001) are all unchanged. The only wording update in this revision is the</w:t>
+        <w:t xml:space="preserve">position (former DEC-001) is</w:t>
+      </w:r>
+      <w:r>
+        <w:t xml:space="preserve"> </w:t>
+      </w:r>
+      <w:r>
+        <w:rPr>
+          <w:bCs/>
+          <w:b/>
+        </w:rPr>
+        <w:t xml:space="preserve">superseded</w:t>
+      </w:r>
+      <w:r>
+        <w:t xml:space="preserve">. Middle East DR</w:t>
+      </w:r>
+      <w:r>
+        <w:t xml:space="preserve"> </w:t>
+      </w:r>
+      <w:r>
+        <w:rPr>
+          <w:bCs/>
+          <w:b/>
+        </w:rPr>
+        <w:t xml:space="preserve">is now offered</w:t>
+      </w:r>
+      <w:r>
+        <w:t xml:space="preserve"> </w:t>
+      </w:r>
+      <w:r>
+        <w:t xml:space="preserve">as a</w:t>
+      </w:r>
+      <w:r>
+        <w:t xml:space="preserve"> </w:t>
+      </w:r>
+      <w:r>
+        <w:rPr>
+          <w:bCs/>
+          <w:b/>
+        </w:rPr>
+        <w:t xml:space="preserve">cross-geo DR</w:t>
+      </w:r>
+      <w:r>
+        <w:t xml:space="preserve"> </w:t>
+      </w:r>
+      <w:r>
+        <w:t xml:space="preserve">distribution model:</w:t>
+      </w:r>
+      <w:r>
+        <w:t xml:space="preserve"> </w:t>
+      </w:r>
+      <w:r>
+        <w:rPr>
+          <w:bCs/>
+          <w:b/>
+        </w:rPr>
+        <w:t xml:space="preserve">Prod and CVAL co-locate in a selected Middle East Standard region</w:t>
+      </w:r>
+      <w:r>
+        <w:t xml:space="preserve"> </w:t>
+      </w:r>
+      <w:r>
+        <w:t xml:space="preserve">(separate CRGs — co-location in a region is not capacity sharing, ENV-003) and</w:t>
+      </w:r>
+      <w:r>
+        <w:t xml:space="preserve"> </w:t>
+      </w:r>
+      <w:r>
+        <w:rPr>
+          <w:bCs/>
+          <w:b/>
+        </w:rPr>
+        <w:t xml:space="preserve">DR is placed cross-geo in a weighted-selected Europe Standard region</w:t>
+      </w:r>
+      <w:r>
+        <w:t xml:space="preserve">. Both the Middle East (Prod+CVAL) and Europe (DR) selections run through the</w:t>
+      </w:r>
+      <w:r>
+        <w:t xml:space="preserve"> </w:t>
+      </w:r>
+      <w:r>
+        <w:rPr>
+          <w:bCs/>
+          <w:b/>
+        </w:rPr>
+        <w:t xml:space="preserve">weighted capacity placement model</w:t>
+      </w:r>
+      <w:r>
+        <w:t xml:space="preserve">. New codes:</w:t>
+      </w:r>
+      <w:r>
+        <w:t xml:space="preserve"> </w:t>
+      </w:r>
+      <w:r>
+        <w:rPr>
+          <w:bCs/>
+          <w:b/>
+        </w:rPr>
+        <w:t xml:space="preserve">DR-020</w:t>
+      </w:r>
+      <w:r>
+        <w:t xml:space="preserve"> </w:t>
+      </w:r>
+      <w:r>
+        <w:t xml:space="preserve">(cross-geo DR ME→Europe),</w:t>
+      </w:r>
+      <w:r>
+        <w:t xml:space="preserve"> </w:t>
+      </w:r>
+      <w:r>
+        <w:rPr>
+          <w:bCs/>
+          <w:b/>
+        </w:rPr>
+        <w:t xml:space="preserve">PLC-010b</w:t>
+      </w:r>
+      <w:r>
+        <w:t xml:space="preserve"> </w:t>
+      </w:r>
+      <w:r>
+        <w:t xml:space="preserve">(cross-geo DR override to the PLC-010a co-location rule),</w:t>
+      </w:r>
+      <w:r>
+        <w:t xml:space="preserve"> </w:t>
+      </w:r>
+      <w:r>
+        <w:rPr>
+          <w:bCs/>
+          <w:b/>
+        </w:rPr>
+        <w:t xml:space="preserve">A-ME1</w:t>
+      </w:r>
+      <w:r>
+        <w:t xml:space="preserve"> </w:t>
+      </w:r>
+      <w:r>
+        <w:t xml:space="preserve">(data-residency assumption). This introduces a</w:t>
+      </w:r>
+      <w:r>
+        <w:t xml:space="preserve"> </w:t>
+      </w:r>
+      <w:r>
+        <w:rPr>
+          <w:bCs/>
+          <w:b/>
+        </w:rPr>
+        <w:t xml:space="preserve">third distribution model</w:t>
+      </w:r>
+      <w:r>
+        <w:t xml:space="preserve"> </w:t>
+      </w:r>
+      <w:r>
+        <w:t xml:space="preserve">—</w:t>
       </w:r>
       <w:r>
         <w:t xml:space="preserve"> </w:t>
@@ -250,47 +438,61 @@
           <w:iCs/>
           <w:i/>
         </w:rPr>
-        <w:t xml:space="preserve">region-model gate</w:t>
-      </w:r>
-      <w:r>
-        <w:t xml:space="preserve"> </w:t>
-      </w:r>
-      <w:r>
-        <w:t xml:space="preserve">(below), whose legacy</w:t>
-      </w:r>
-      <w:r>
-        <w:t xml:space="preserve"> </w:t>
-      </w:r>
-      <w:r>
-        <w:t xml:space="preserve">“</w:t>
-      </w:r>
-      <w:r>
-        <w:t xml:space="preserve">three-region gate</w:t>
-      </w:r>
-      <w:r>
-        <w:t xml:space="preserve">”</w:t>
-      </w:r>
-      <w:r>
-        <w:t xml:space="preserve"> </w:t>
-      </w:r>
-      <w:r>
-        <w:t xml:space="preserve">label is replaced with an explicit geography-aware statement so it can no longer be read as a universal three-distinct-regions minimum. The new per-AZ CRG structure (CAP-023) operates</w:t>
-      </w:r>
-      <w:r>
-        <w:t xml:space="preserve"> </w:t>
-      </w:r>
-      <w:r>
-        <w:rPr>
-          <w:bCs/>
-          <w:b/>
-        </w:rPr>
-        <w:t xml:space="preserve">within</w:t>
-      </w:r>
-      <w:r>
-        <w:t xml:space="preserve"> </w:t>
-      </w:r>
-      <w:r>
-        <w:t xml:space="preserve">a selected region and is specified in ADR-002/ADR-004, not here.</w:t>
+        <w:t xml:space="preserve">cross-geo DR</w:t>
+      </w:r>
+      <w:r>
+        <w:t xml:space="preserve"> </w:t>
+      </w:r>
+      <w:r>
+        <w:t xml:space="preserve">— distinct from the US three-region model and the standard two-region co-located model. The CVAL-sacrifice DR bootstrap (DR-005/006) does</w:t>
+      </w:r>
+      <w:r>
+        <w:t xml:space="preserve"> </w:t>
+      </w:r>
+      <w:r>
+        <w:rPr>
+          <w:bCs/>
+          <w:b/>
+        </w:rPr>
+        <w:t xml:space="preserve">not</w:t>
+      </w:r>
+      <w:r>
+        <w:t xml:space="preserve"> </w:t>
+      </w:r>
+      <w:r>
+        <w:t xml:space="preserve">apply to the Middle East; ME DR uses dedicated reserved capacity in Europe. Europe now additionally serves as a</w:t>
+      </w:r>
+      <w:r>
+        <w:t xml:space="preserve"> </w:t>
+      </w:r>
+      <w:r>
+        <w:rPr>
+          <w:bCs/>
+          <w:b/>
+        </w:rPr>
+        <w:t xml:space="preserve">cross-geo DR destination</w:t>
+      </w:r>
+      <w:r>
+        <w:t xml:space="preserve"> </w:t>
+      </w:r>
+      <w:r>
+        <w:t xml:space="preserve">for the Middle East. The relevant sections below carry inline</w:t>
+      </w:r>
+      <w:r>
+        <w:t xml:space="preserve"> </w:t>
+      </w:r>
+      <w:r>
+        <w:rPr>
+          <w:bCs/>
+          <w:b/>
+        </w:rPr>
+        <w:t xml:space="preserve">[Amended v2.4]</w:t>
+      </w:r>
+      <w:r>
+        <w:t xml:space="preserve"> </w:t>
+      </w:r>
+      <w:r>
+        <w:t xml:space="preserve">markers.</w:t>
       </w:r>
     </w:p>
     <w:p>
@@ -525,7 +727,20 @@
         <w:t xml:space="preserve"> </w:t>
       </w:r>
       <w:r>
-        <w:t xml:space="preserve">(baseline Section 6, REG-001). The US is the only three-region geography; EU, Australia, Asia Pacific and the Middle East are two-region geographies. New regions (e.g. Japan East, pending) are policy data added by config, not automatic rollout commitments.</w:t>
+        <w:t xml:space="preserve">(baseline Section 6, REG-001). The US is the only three-region geography; EU, Australia and Asia Pacific are standard two-region (co-located CVAL/DR) geographies;</w:t>
+      </w:r>
+      <w:r>
+        <w:t xml:space="preserve"> </w:t>
+      </w:r>
+      <w:r>
+        <w:rPr>
+          <w:bCs/>
+          <w:b/>
+        </w:rPr>
+        <w:t xml:space="preserve">the Middle East is a cross-geo DR geography [Amended v2.4]</w:t>
+      </w:r>
+      <w:r>
+        <w:t xml:space="preserve">. New regions (e.g. Japan East, pending) are policy data added by config, not automatic rollout commitments.</w:t>
       </w:r>
       <w:r>
         <w:t xml:space="preserve"> </w:t>
@@ -550,7 +765,7 @@
           <w:bCs/>
           <w:b/>
         </w:rPr>
-        <w:t xml:space="preserve">Middle East DR is currently</w:t>
+        <w:t xml:space="preserve">Middle East DR is now offered as a cross-geo DR model [Amended v2.4] (DR-020, PLC-010b; supersedes DR-014/DEC-001</w:t>
       </w:r>
       <w:r>
         <w:rPr>
@@ -572,80 +787,58 @@
           <w:bCs/>
           <w:b/>
         </w:rPr>
-        <w:t xml:space="preserve"> </w:t>
-      </w:r>
-      <w:r>
-        <w:rPr>
-          <w:bCs/>
-          <w:b/>
-        </w:rPr>
-        <w:t xml:space="preserve">(DR-014, DEC-001 — under legal review).</w:t>
-      </w:r>
-      <w:r>
-        <w:t xml:space="preserve"> </w:t>
-      </w:r>
-      <w:r>
-        <w:t xml:space="preserve">As it stands, DR is</w:t>
-      </w:r>
-      <w:r>
-        <w:t xml:space="preserve"> </w:t>
-      </w:r>
-      <w:r>
-        <w:rPr>
-          <w:bCs/>
-          <w:b/>
-        </w:rPr>
-        <w:t xml:space="preserve">not offered</w:t>
-      </w:r>
-      <w:r>
-        <w:t xml:space="preserve"> </w:t>
-      </w:r>
-      <w:r>
-        <w:t xml:space="preserve">in the Middle East: Legal owns the programme and data-sovereignty/residency laws (a largely government/medical customer base) mean cross-border DR cannot meet residency requirements (baseline Section 2, Section 5.2, Section 6). Middle East placement therefore defaults to</w:t>
-      </w:r>
-      <w:r>
-        <w:t xml:space="preserve"> </w:t>
-      </w:r>
-      <w:r>
-        <w:rPr>
-          <w:rStyle w:val="VerbatimChar"/>
-        </w:rPr>
-        <w:t xml:space="preserve">dr_region = NOT_OFFERED</w:t>
-      </w:r>
-      <w:r>
-        <w:t xml:space="preserve">; production may still be placed in-geo without DR. Switzerland North is a</w:t>
-      </w:r>
-      <w:r>
-        <w:t xml:space="preserve"> </w:t>
-      </w:r>
-      <w:r>
-        <w:rPr>
-          <w:bCs/>
-          <w:b/>
-        </w:rPr>
-        <w:t xml:space="preserve">pre-configured, conditional</w:t>
-      </w:r>
-      <w:r>
-        <w:t xml:space="preserve"> </w:t>
-      </w:r>
-      <w:r>
-        <w:t xml:space="preserve">cross-geo extension that activates</w:t>
-      </w:r>
-      <w:r>
-        <w:t xml:space="preserve"> </w:t>
-      </w:r>
-      <w:r>
-        <w:rPr>
-          <w:bCs/>
-          <w:b/>
-        </w:rPr>
-        <w:t xml:space="preserve">only if</w:t>
-      </w:r>
-      <w:r>
-        <w:t xml:space="preserve"> </w:t>
-      </w:r>
-      <w:r>
-        <w:t xml:space="preserve">Legal clears DEC-001.</w:t>
+        <w:t xml:space="preserve">).</w:t>
+      </w:r>
+      <w:r>
+        <w:t xml:space="preserve"> </w:t>
+      </w:r>
+      <w:r>
+        <w:t xml:space="preserve">Per the 11 Sep 2026 amendment to baseline v2.4,</w:t>
+      </w:r>
+      <w:r>
+        <w:t xml:space="preserve"> </w:t>
+      </w:r>
+      <w:r>
+        <w:rPr>
+          <w:bCs/>
+          <w:b/>
+        </w:rPr>
+        <w:t xml:space="preserve">Prod and CVAL co-locate in a selected Middle East Standard region</w:t>
+      </w:r>
+      <w:r>
+        <w:t xml:space="preserve"> </w:t>
+      </w:r>
+      <w:r>
+        <w:t xml:space="preserve">(separate CRGs — ENV-003) and</w:t>
+      </w:r>
+      <w:r>
+        <w:t xml:space="preserve"> </w:t>
+      </w:r>
+      <w:r>
+        <w:rPr>
+          <w:bCs/>
+          <w:b/>
+        </w:rPr>
+        <w:t xml:space="preserve">DR is placed cross-geo in a weighted-selected Europe Standard region</w:t>
+      </w:r>
+      <w:r>
+        <w:t xml:space="preserve">. Both selections run the weighted capacity placement model. Data-residency for the DR copy is governed by assumption</w:t>
+      </w:r>
+      <w:r>
+        <w:t xml:space="preserve"> </w:t>
+      </w:r>
+      <w:r>
+        <w:rPr>
+          <w:bCs/>
+          <w:b/>
+        </w:rPr>
+        <w:t xml:space="preserve">A-ME1</w:t>
+      </w:r>
+      <w:r>
+        <w:t xml:space="preserve"> </w:t>
+      </w:r>
+      <w:r>
+        <w:t xml:space="preserve">(Europe as the approved cross-geo destination); per-country legal carve-outs remain possible but are out of scope of the automated engine.</w:t>
       </w:r>
       <w:r>
         <w:t xml:space="preserve"> </w:t>
@@ -1030,7 +1223,7 @@
         <w:t xml:space="preserve"> </w:t>
       </w:r>
       <w:r>
-        <w:t xml:space="preserve">(three-region vs two-region), zone support, SKU/family eligibility, separation class, approved cross-geo extension paths,</w:t>
+        <w:t xml:space="preserve">(three-region, two-region co-located, or cross-geo DR — see below), zone support, SKU/family eligibility, separation class, approved cross-geo extension paths,</w:t>
       </w:r>
       <w:r>
         <w:t xml:space="preserve"> </w:t>
@@ -1157,32 +1350,29 @@
               <w:jc w:val="left"/>
             </w:pPr>
             <w:r>
-              <w:t xml:space="preserve">Cross-geo extension</w:t>
-            </w:r>
-          </w:p>
-        </w:tc>
-        <w:tc>
-          <w:tcPr/>
-          <w:p>
-            <w:pPr>
-              <w:pStyle w:val="Compact"/>
-              <w:jc w:val="left"/>
-            </w:pPr>
-            <w:r>
-              <w:t xml:space="preserve">Usable only when explicitly approved for the source geography. For the</w:t>
-            </w:r>
-            <w:r>
-              <w:t xml:space="preserve"> </w:t>
-            </w:r>
+              <w:t xml:space="preserve">Cross-geo DR destination</w:t>
+            </w:r>
+          </w:p>
+        </w:tc>
+        <w:tc>
+          <w:tcPr/>
+          <w:p>
+            <w:pPr>
+              <w:pStyle w:val="Compact"/>
+              <w:jc w:val="left"/>
+            </w:pPr>
             <w:r>
               <w:rPr>
                 <w:bCs/>
                 <w:b/>
               </w:rPr>
-              <w:t xml:space="preserve">Middle East</w:t>
-            </w:r>
-            <w:r>
-              <w:t xml:space="preserve">, the Switzerland North extension is pre-configured but</w:t>
+              <w:t xml:space="preserve">[Amended v2.4]</w:t>
+            </w:r>
+            <w:r>
+              <w:t xml:space="preserve"> </w:t>
+            </w:r>
+            <w:r>
+              <w:t xml:space="preserve">A geography approved to host cross-geo DR for another geography’s source regions.</w:t>
             </w:r>
             <w:r>
               <w:t xml:space="preserve"> </w:t>
@@ -1192,43 +1382,47 @@
                 <w:bCs/>
                 <w:b/>
               </w:rPr>
-              <w:t xml:space="preserve">inactive</w:t>
+              <w:t xml:space="preserve">Europe is the approved cross-geo DR destination for the Middle East</w:t>
             </w:r>
             <w:r>
               <w:t xml:space="preserve"> </w:t>
             </w:r>
             <w:r>
-              <w:t xml:space="preserve">until DEC-001 legal approval clears</w:t>
+              <w:t xml:space="preserve">(A-ME1): the DR region is</w:t>
             </w:r>
             <w:r>
               <w:t xml:space="preserve"> </w:t>
             </w:r>
+            <w:r>
+              <w:rPr>
+                <w:bCs/>
+                <w:b/>
+              </w:rPr>
+              <w:t xml:space="preserve">weighted-selected among Europe Standard regions</w:t>
+            </w:r>
+            <w:r>
+              <w:t xml:space="preserve"> </w:t>
+            </w:r>
+            <w:r>
+              <w:t xml:space="preserve">(DR-020, PLC-010b), not a single fixed region.</w:t>
+            </w:r>
+          </w:p>
+        </w:tc>
+      </w:tr>
+      <w:tr>
+        <w:tc>
+          <w:tcPr/>
+          <w:p>
+            <w:pPr>
+              <w:pStyle w:val="Compact"/>
+              <w:jc w:val="left"/>
+            </w:pPr>
             <w:r>
               <w:rPr>
                 <w:rStyle w:val="VerbatimChar"/>
               </w:rPr>
               <w:t xml:space="preserve">DR_NOT_OFFERED</w:t>
             </w:r>
-            <w:r>
-              <w:t xml:space="preserve">.</w:t>
-            </w:r>
-          </w:p>
-        </w:tc>
-      </w:tr>
-      <w:tr>
-        <w:tc>
-          <w:tcPr/>
-          <w:p>
-            <w:pPr>
-              <w:pStyle w:val="Compact"/>
-              <w:jc w:val="left"/>
-            </w:pPr>
-            <w:r>
-              <w:rPr>
-                <w:rStyle w:val="VerbatimChar"/>
-              </w:rPr>
-              <w:t xml:space="preserve">DR_NOT_OFFERED</w:t>
-            </w:r>
           </w:p>
         </w:tc>
         <w:tc>
@@ -1261,58 +1455,13 @@
                 <w:bCs/>
                 <w:b/>
               </w:rPr>
-              <w:t xml:space="preserve">Default</w:t>
-            </w:r>
-            <w:r>
-              <w:rPr>
-                <w:bCs/>
-                <w:b/>
-              </w:rPr>
+              <w:t xml:space="preserve">No longer set for the Middle East [Amended v2.4]</w:t>
+            </w:r>
+            <w:r>
               <w:t xml:space="preserve"> </w:t>
             </w:r>
             <w:r>
-              <w:rPr>
-                <w:rStyle w:val="VerbatimChar"/>
-                <w:bCs/>
-                <w:b/>
-              </w:rPr>
-              <w:t xml:space="preserve">true</w:t>
-            </w:r>
-            <w:r>
-              <w:rPr>
-                <w:bCs/>
-                <w:b/>
-              </w:rPr>
-              <w:t xml:space="preserve"> </w:t>
-            </w:r>
-            <w:r>
-              <w:rPr>
-                <w:bCs/>
-                <w:b/>
-              </w:rPr>
-              <w:t xml:space="preserve">for the Middle East</w:t>
-            </w:r>
-            <w:r>
-              <w:t xml:space="preserve"> </w:t>
-            </w:r>
-            <w:r>
-              <w:t xml:space="preserve">(DR-014, current legal position pending DEC-001) — evaluated</w:t>
-            </w:r>
-            <w:r>
-              <w:t xml:space="preserve"> </w:t>
-            </w:r>
-            <w:r>
-              <w:rPr>
-                <w:bCs/>
-                <w:b/>
-              </w:rPr>
-              <w:t xml:space="preserve">before</w:t>
-            </w:r>
-            <w:r>
-              <w:t xml:space="preserve"> </w:t>
-            </w:r>
-            <w:r>
-              <w:t xml:space="preserve">any cross-geo extension so an inactive extension is never auto-applied.</w:t>
+              <w:t xml:space="preserve">— the former Middle East default (DR-014/DEC-001) is superseded by the cross-geo DR model (DR-020). The flag remains available for any future geography/country that Legal declares no-DR.</w:t>
             </w:r>
           </w:p>
         </w:tc>
@@ -1362,344 +1511,20 @@
         <w:t xml:space="preserve">distribution model</w:t>
       </w:r>
       <w:r>
-        <w:t xml:space="preserve">, not a universal minimum. The</w:t>
-      </w:r>
-      <w:r>
-        <w:t xml:space="preserve"> </w:t>
-      </w:r>
-      <w:r>
-        <w:rPr>
-          <w:bCs/>
-          <w:b/>
-        </w:rPr>
-        <w:t xml:space="preserve">US is a three-region geography</w:t>
-      </w:r>
-      <w:r>
-        <w:t xml:space="preserve"> </w:t>
-      </w:r>
-      <w:r>
-        <w:t xml:space="preserve">— production, CVAL and DR each sit in a distinct region.</w:t>
-      </w:r>
-      <w:r>
-        <w:t xml:space="preserve"> </w:t>
-      </w:r>
-      <w:r>
-        <w:rPr>
-          <w:bCs/>
-          <w:b/>
-        </w:rPr>
-        <w:t xml:space="preserve">EU, Australia, Asia Pacific and the Middle East are two-region geographies</w:t>
-      </w:r>
-      <w:r>
-        <w:t xml:space="preserve">: production is placed in one region and</w:t>
-      </w:r>
-      <w:r>
-        <w:t xml:space="preserve"> </w:t>
-      </w:r>
-      <w:r>
-        <w:rPr>
-          <w:bCs/>
-          <w:b/>
-        </w:rPr>
-        <w:t xml:space="preserve">CVAL and DR are co-located in the other region</w:t>
-      </w:r>
-      <w:r>
-        <w:t xml:space="preserve"> </w:t>
-      </w:r>
-      <w:r>
-        <w:t xml:space="preserve">(mandatory rule</w:t>
-      </w:r>
-      <w:r>
-        <w:t xml:space="preserve"> </w:t>
-      </w:r>
-      <w:r>
-        <w:rPr>
-          <w:bCs/>
-          <w:b/>
-        </w:rPr>
-        <w:t xml:space="preserve">PLC-010a</w:t>
-      </w:r>
-      <w:r>
-        <w:t xml:space="preserve">, via environment separation ENV-003). A two-region geography therefore delivers in-geo Prod + CVAL + DR</w:t>
-      </w:r>
-      <w:r>
-        <w:t xml:space="preserve"> </w:t>
-      </w:r>
-      <w:r>
-        <w:rPr>
-          <w:bCs/>
-          <w:b/>
-        </w:rPr>
-        <w:t xml:space="preserve">without</w:t>
-      </w:r>
-      <w:r>
-        <w:t xml:space="preserve"> </w:t>
-      </w:r>
-      <w:r>
-        <w:t xml:space="preserve">any cross-geo path — co-location is the standard model, not a fallback. The</w:t>
-      </w:r>
-      <w:r>
-        <w:t xml:space="preserve"> </w:t>
-      </w:r>
-      <w:r>
-        <w:rPr>
-          <w:bCs/>
-          <w:b/>
-        </w:rPr>
-        <w:t xml:space="preserve">Middle East is the single exception</w:t>
-      </w:r>
-      <w:r>
-        <w:t xml:space="preserve">: DR is</w:t>
-      </w:r>
-      <w:r>
-        <w:t xml:space="preserve"> </w:t>
-      </w:r>
-      <w:r>
-        <w:rPr>
-          <w:rStyle w:val="VerbatimChar"/>
-        </w:rPr>
-        <w:t xml:space="preserve">DR_NOT_OFFERED</w:t>
-      </w:r>
-      <w:r>
-        <w:t xml:space="preserve"> </w:t>
-      </w:r>
-      <w:r>
-        <w:t xml:space="preserve">(DR-014, DEC-001), so its second region hosts CVAL only and production may exist without DR. Cross-geo extension (Switzerland North) applies</w:t>
-      </w:r>
-      <w:r>
-        <w:t xml:space="preserve"> </w:t>
-      </w:r>
-      <w:r>
-        <w:rPr>
-          <w:bCs/>
-          <w:b/>
-        </w:rPr>
-        <w:t xml:space="preserve">only</w:t>
-      </w:r>
-      <w:r>
-        <w:t xml:space="preserve"> </w:t>
-      </w:r>
-      <w:r>
-        <w:t xml:space="preserve">to the Middle East and only if Legal clears DEC-001.</w:t>
-      </w:r>
-      <w:r>
-        <w:t xml:space="preserve"> </w:t>
-      </w:r>
-      <w:r>
-        <w:rPr>
-          <w:rStyle w:val="VerbatimChar"/>
-        </w:rPr>
-        <w:t xml:space="preserve">[Derived]</w:t>
-      </w:r>
-    </w:p>
-    <w:bookmarkEnd w:id="22"/>
-    <w:bookmarkStart w:id="23" w:name="placement-flow"/>
-    <w:p>
-      <w:pPr>
-        <w:pStyle w:val="Heading2"/>
-      </w:pPr>
-      <w:r>
-        <w:t xml:space="preserve">Placement Flow</w:t>
-      </w:r>
-    </w:p>
-    <w:p>
-      <w:pPr>
-        <w:pStyle w:val="SourceCode"/>
-      </w:pPr>
-      <w:r>
-        <w:rPr>
-          <w:rStyle w:val="VerbatimChar"/>
-        </w:rPr>
-        <w:t xml:space="preserve">flowchart TD</w:t>
-      </w:r>
-      <w:r>
-        <w:br/>
-      </w:r>
-      <w:r>
-        <w:rPr>
-          <w:rStyle w:val="VerbatimChar"/>
-        </w:rPr>
-        <w:t xml:space="preserve">    Request[Placement request] --&gt; ExistingSeed{Seed exists?}</w:t>
-      </w:r>
-      <w:r>
-        <w:br/>
-      </w:r>
-      <w:r>
-        <w:rPr>
-          <w:rStyle w:val="VerbatimChar"/>
-        </w:rPr>
-        <w:t xml:space="preserve">    ExistingSeed -- Yes --&gt; Reuse[Reuse CustomerSeedRecord]</w:t>
-      </w:r>
-      <w:r>
-        <w:br/>
-      </w:r>
-      <w:r>
-        <w:rPr>
-          <w:rStyle w:val="VerbatimChar"/>
-        </w:rPr>
-        <w:t xml:space="preserve">    ExistingSeed -- No --&gt; Input{Input mode}</w:t>
-      </w:r>
-      <w:r>
-        <w:br/>
-      </w:r>
-      <w:r>
-        <w:rPr>
-          <w:rStyle w:val="VerbatimChar"/>
-        </w:rPr>
-        <w:t xml:space="preserve">    Input -- Exact production region --&gt; ValidateProd[Validate production region]</w:t>
-      </w:r>
-      <w:r>
-        <w:br/>
-      </w:r>
-      <w:r>
-        <w:rPr>
-          <w:rStyle w:val="VerbatimChar"/>
-        </w:rPr>
-        <w:t xml:space="preserve">    Input -- Geography exception --&gt; GeoApproval{Exception approved and acknowledged?}</w:t>
-      </w:r>
-      <w:r>
-        <w:br/>
-      </w:r>
-      <w:r>
-        <w:rPr>
-          <w:rStyle w:val="VerbatimChar"/>
-        </w:rPr>
-        <w:t xml:space="preserve">    GeoApproval -- No --&gt; PolicyBlocked[POLICY_BLOCKED]</w:t>
-      </w:r>
-      <w:r>
-        <w:br/>
-      </w:r>
-      <w:r>
-        <w:rPr>
-          <w:rStyle w:val="VerbatimChar"/>
-        </w:rPr>
-        <w:t xml:space="preserve">    GeoApproval -- Yes --&gt; DeriveProd[Derive production from Standard regions]</w:t>
-      </w:r>
-      <w:r>
-        <w:br/>
-      </w:r>
-      <w:r>
-        <w:rPr>
-          <w:rStyle w:val="VerbatimChar"/>
-        </w:rPr>
-        <w:t xml:space="preserve">    ValidateProd --&gt; ProdOk{Region valid, fresh, supported?}</w:t>
-      </w:r>
-      <w:r>
-        <w:br/>
-      </w:r>
-      <w:r>
-        <w:rPr>
-          <w:rStyle w:val="VerbatimChar"/>
-        </w:rPr>
-        <w:t xml:space="preserve">    DeriveProd --&gt; ProdOk</w:t>
-      </w:r>
-      <w:r>
-        <w:br/>
-      </w:r>
-      <w:r>
-        <w:rPr>
-          <w:rStyle w:val="VerbatimChar"/>
-        </w:rPr>
-        <w:t xml:space="preserve">    ProdOk -- No --&gt; NotReady[Readiness reason]</w:t>
-      </w:r>
-      <w:r>
-        <w:br/>
-      </w:r>
-      <w:r>
-        <w:rPr>
-          <w:rStyle w:val="VerbatimChar"/>
-        </w:rPr>
-        <w:t xml:space="preserve">    ProdOk -- Yes --&gt; SelectCVAL[Select or validate CVAL]</w:t>
-      </w:r>
-      <w:r>
-        <w:br/>
-      </w:r>
-      <w:r>
-        <w:rPr>
-          <w:rStyle w:val="VerbatimChar"/>
-        </w:rPr>
-        <w:t xml:space="preserve">    SelectCVAL --&gt; SelectDR[Select DR or NOT_OFFERED]</w:t>
-      </w:r>
-      <w:r>
-        <w:br/>
-      </w:r>
-      <w:r>
-        <w:rPr>
-          <w:rStyle w:val="VerbatimChar"/>
-        </w:rPr>
-        <w:t xml:space="preserve">    SelectDR --&gt; Fresh{State fresh?}</w:t>
-      </w:r>
-      <w:r>
-        <w:br/>
-      </w:r>
-      <w:r>
-        <w:rPr>
-          <w:rStyle w:val="VerbatimChar"/>
-        </w:rPr>
-        <w:t xml:space="preserve">    Fresh -- No --&gt; Stale[STALE_STATE]</w:t>
-      </w:r>
-      <w:r>
-        <w:br/>
-      </w:r>
-      <w:r>
-        <w:rPr>
-          <w:rStyle w:val="VerbatimChar"/>
-        </w:rPr>
-        <w:t xml:space="preserve">    Fresh -- Yes --&gt; Hold[Create atomic placement hold]</w:t>
-      </w:r>
-      <w:r>
-        <w:br/>
-      </w:r>
-      <w:r>
-        <w:rPr>
-          <w:rStyle w:val="VerbatimChar"/>
-        </w:rPr>
-        <w:t xml:space="preserve">    Hold --&gt; Seed[Write CustomerSeedRecord]</w:t>
-      </w:r>
-      <w:r>
-        <w:br/>
-      </w:r>
-      <w:r>
-        <w:rPr>
-          <w:rStyle w:val="VerbatimChar"/>
-        </w:rPr>
-        <w:t xml:space="preserve">    Reuse --&gt; Readiness[Return DeploymentReadinessResult]</w:t>
-      </w:r>
-      <w:r>
-        <w:br/>
-      </w:r>
-      <w:r>
-        <w:rPr>
-          <w:rStyle w:val="VerbatimChar"/>
-        </w:rPr>
-        <w:t xml:space="preserve">    Seed --&gt; Readiness</w:t>
-      </w:r>
-    </w:p>
-    <w:bookmarkEnd w:id="23"/>
-    <w:bookmarkStart w:id="24" w:name="customerseedrecord"/>
-    <w:p>
-      <w:pPr>
-        <w:pStyle w:val="Heading2"/>
-      </w:pPr>
-      <w:r>
-        <w:t xml:space="preserve">CustomerSeedRecord</w:t>
-      </w:r>
-    </w:p>
-    <w:p>
-      <w:pPr>
-        <w:pStyle w:val="FirstParagraph"/>
-      </w:pPr>
-      <w:r>
-        <w:rPr>
-          <w:rStyle w:val="VerbatimChar"/>
-        </w:rPr>
-        <w:t xml:space="preserve">CustomerSeedRecord</w:t>
-      </w:r>
-      <w:r>
-        <w:t xml:space="preserve"> </w:t>
-      </w:r>
-      <w:r>
-        <w:t xml:space="preserve">must include:</w:t>
+        <w:t xml:space="preserve">, not a universal minimum. There are</w:t>
+      </w:r>
+      <w:r>
+        <w:t xml:space="preserve"> </w:t>
+      </w:r>
+      <w:r>
+        <w:rPr>
+          <w:bCs/>
+          <w:b/>
+        </w:rPr>
+        <w:t xml:space="preserve">three distribution models [Amended v2.4]</w:t>
+      </w:r>
+      <w:r>
+        <w:t xml:space="preserve">:</w:t>
       </w:r>
     </w:p>
     <w:p>
@@ -1711,7 +1536,17 @@
         <w:pStyle w:val="Compact"/>
       </w:pPr>
       <w:r>
-        <w:t xml:space="preserve">seed ID and customer/realm identifier;</w:t>
+        <w:rPr>
+          <w:bCs/>
+          <w:b/>
+        </w:rPr>
+        <w:t xml:space="preserve">Three-region (US).</w:t>
+      </w:r>
+      <w:r>
+        <w:t xml:space="preserve"> </w:t>
+      </w:r>
+      <w:r>
+        <w:t xml:space="preserve">Production, CVAL and DR each sit in a distinct in-geo region.</w:t>
       </w:r>
     </w:p>
     <w:p>
@@ -1723,7 +1558,62 @@
         <w:pStyle w:val="Compact"/>
       </w:pPr>
       <w:r>
-        <w:t xml:space="preserve">geography;</w:t>
+        <w:rPr>
+          <w:bCs/>
+          <w:b/>
+        </w:rPr>
+        <w:t xml:space="preserve">Two-region co-located (EU, Australia, Asia Pacific).</w:t>
+      </w:r>
+      <w:r>
+        <w:t xml:space="preserve"> </w:t>
+      </w:r>
+      <w:r>
+        <w:t xml:space="preserve">Production is placed in one region and</w:t>
+      </w:r>
+      <w:r>
+        <w:t xml:space="preserve"> </w:t>
+      </w:r>
+      <w:r>
+        <w:rPr>
+          <w:bCs/>
+          <w:b/>
+        </w:rPr>
+        <w:t xml:space="preserve">CVAL and DR are co-located in the other region</w:t>
+      </w:r>
+      <w:r>
+        <w:t xml:space="preserve"> </w:t>
+      </w:r>
+      <w:r>
+        <w:t xml:space="preserve">(mandatory rule</w:t>
+      </w:r>
+      <w:r>
+        <w:t xml:space="preserve"> </w:t>
+      </w:r>
+      <w:r>
+        <w:rPr>
+          <w:bCs/>
+          <w:b/>
+        </w:rPr>
+        <w:t xml:space="preserve">PLC-010a</w:t>
+      </w:r>
+      <w:r>
+        <w:t xml:space="preserve">, via environment separation ENV-003). This delivers in-geo Prod + CVAL + DR</w:t>
+      </w:r>
+      <w:r>
+        <w:t xml:space="preserve"> </w:t>
+      </w:r>
+      <w:r>
+        <w:rPr>
+          <w:bCs/>
+          <w:b/>
+        </w:rPr>
+        <w:t xml:space="preserve">without</w:t>
+      </w:r>
+      <w:r>
+        <w:t xml:space="preserve"> </w:t>
+      </w:r>
+      <w:r>
+        <w:t xml:space="preserve">any cross-geo path — co-location is the standard model, not a fallback.</w:t>
       </w:r>
     </w:p>
     <w:p>
@@ -1735,134 +1625,469 @@
         <w:pStyle w:val="Compact"/>
       </w:pPr>
       <w:r>
-        <w:t xml:space="preserve">production region;</w:t>
+        <w:rPr>
+          <w:bCs/>
+          <w:b/>
+        </w:rPr>
+        <w:t xml:space="preserve">Cross-geo DR (Middle East) [Amended v2.4].</w:t>
+      </w:r>
+      <w:r>
+        <w:t xml:space="preserve"> </w:t>
+      </w:r>
+      <w:r>
+        <w:rPr>
+          <w:bCs/>
+          <w:b/>
+        </w:rPr>
+        <w:t xml:space="preserve">Prod and CVAL co-locate in a selected Middle East Standard region</w:t>
+      </w:r>
+      <w:r>
+        <w:t xml:space="preserve"> </w:t>
+      </w:r>
+      <w:r>
+        <w:t xml:space="preserve">(separate CRGs; co-location in a region is not capacity sharing, ENV-003) and</w:t>
+      </w:r>
+      <w:r>
+        <w:t xml:space="preserve"> </w:t>
+      </w:r>
+      <w:r>
+        <w:rPr>
+          <w:bCs/>
+          <w:b/>
+        </w:rPr>
+        <w:t xml:space="preserve">DR is placed cross-geo in a weighted-selected Europe Standard region</w:t>
+      </w:r>
+      <w:r>
+        <w:t xml:space="preserve"> </w:t>
+      </w:r>
+      <w:r>
+        <w:t xml:space="preserve">(DR-020, PLC-010b). Both the source (Middle East Prod+CVAL) and destination (Europe DR) selections run the weighted capacity placement model. This model</w:t>
+      </w:r>
+      <w:r>
+        <w:t xml:space="preserve"> </w:t>
+      </w:r>
+      <w:r>
+        <w:rPr>
+          <w:bCs/>
+          <w:b/>
+        </w:rPr>
+        <w:t xml:space="preserve">overrides</w:t>
+      </w:r>
+      <w:r>
+        <w:t xml:space="preserve"> </w:t>
+      </w:r>
+      <w:r>
+        <w:t xml:space="preserve">the PLC-010a co-location rule for the Middle East: CVAL co-locates with</w:t>
+      </w:r>
+      <w:r>
+        <w:t xml:space="preserve"> </w:t>
+      </w:r>
+      <w:r>
+        <w:rPr>
+          <w:bCs/>
+          <w:b/>
+        </w:rPr>
+        <w:t xml:space="preserve">Prod locally</w:t>
+      </w:r>
+      <w:r>
+        <w:t xml:space="preserve">, not with DR, so the CVAL-sacrifice DR bootstrap (DR-005/006) does not apply — ME DR uses dedicated reserved capacity in Europe. The former Middle East</w:t>
+      </w:r>
+      <w:r>
+        <w:t xml:space="preserve"> </w:t>
+      </w:r>
+      <w:r>
+        <w:rPr>
+          <w:rStyle w:val="VerbatimChar"/>
+        </w:rPr>
+        <w:t xml:space="preserve">DR_NOT_OFFERED</w:t>
+      </w:r>
+      <w:r>
+        <w:t xml:space="preserve"> </w:t>
+      </w:r>
+      <w:r>
+        <w:t xml:space="preserve">position (DR-014/DEC-001) is superseded.</w:t>
+      </w:r>
+      <w:r>
+        <w:t xml:space="preserve"> </w:t>
+      </w:r>
+      <w:r>
+        <w:rPr>
+          <w:rStyle w:val="VerbatimChar"/>
+        </w:rPr>
+        <w:t xml:space="preserve">[Derived]</w:t>
+      </w:r>
+    </w:p>
+    <w:bookmarkEnd w:id="22"/>
+    <w:bookmarkStart w:id="23" w:name="placement-flow"/>
+    <w:p>
+      <w:pPr>
+        <w:pStyle w:val="Heading2"/>
+      </w:pPr>
+      <w:r>
+        <w:t xml:space="preserve">Placement Flow</w:t>
+      </w:r>
+    </w:p>
+    <w:p>
+      <w:pPr>
+        <w:pStyle w:val="SourceCode"/>
+      </w:pPr>
+      <w:r>
+        <w:rPr>
+          <w:rStyle w:val="VerbatimChar"/>
+        </w:rPr>
+        <w:t xml:space="preserve">flowchart TD</w:t>
+      </w:r>
+      <w:r>
+        <w:br/>
+      </w:r>
+      <w:r>
+        <w:rPr>
+          <w:rStyle w:val="VerbatimChar"/>
+        </w:rPr>
+        <w:t xml:space="preserve">    Request[Placement request] --&gt; ExistingSeed{Seed exists?}</w:t>
+      </w:r>
+      <w:r>
+        <w:br/>
+      </w:r>
+      <w:r>
+        <w:rPr>
+          <w:rStyle w:val="VerbatimChar"/>
+        </w:rPr>
+        <w:t xml:space="preserve">    ExistingSeed -- Yes --&gt; Reuse[Reuse CustomerSeedRecord]</w:t>
+      </w:r>
+      <w:r>
+        <w:br/>
+      </w:r>
+      <w:r>
+        <w:rPr>
+          <w:rStyle w:val="VerbatimChar"/>
+        </w:rPr>
+        <w:t xml:space="preserve">    ExistingSeed -- No --&gt; Input{Input mode}</w:t>
+      </w:r>
+      <w:r>
+        <w:br/>
+      </w:r>
+      <w:r>
+        <w:rPr>
+          <w:rStyle w:val="VerbatimChar"/>
+        </w:rPr>
+        <w:t xml:space="preserve">    Input -- Exact production region --&gt; ValidateProd[Validate production region]</w:t>
+      </w:r>
+      <w:r>
+        <w:br/>
+      </w:r>
+      <w:r>
+        <w:rPr>
+          <w:rStyle w:val="VerbatimChar"/>
+        </w:rPr>
+        <w:t xml:space="preserve">    Input -- Geography exception --&gt; GeoApproval{Exception approved and acknowledged?}</w:t>
+      </w:r>
+      <w:r>
+        <w:br/>
+      </w:r>
+      <w:r>
+        <w:rPr>
+          <w:rStyle w:val="VerbatimChar"/>
+        </w:rPr>
+        <w:t xml:space="preserve">    GeoApproval -- No --&gt; PolicyBlocked[POLICY_BLOCKED]</w:t>
+      </w:r>
+      <w:r>
+        <w:br/>
+      </w:r>
+      <w:r>
+        <w:rPr>
+          <w:rStyle w:val="VerbatimChar"/>
+        </w:rPr>
+        <w:t xml:space="preserve">    GeoApproval -- Yes --&gt; DeriveProd[Derive production from Standard regions]</w:t>
+      </w:r>
+      <w:r>
+        <w:br/>
+      </w:r>
+      <w:r>
+        <w:rPr>
+          <w:rStyle w:val="VerbatimChar"/>
+        </w:rPr>
+        <w:t xml:space="preserve">    ValidateProd --&gt; ProdOk{Region valid, fresh, supported?}</w:t>
+      </w:r>
+      <w:r>
+        <w:br/>
+      </w:r>
+      <w:r>
+        <w:rPr>
+          <w:rStyle w:val="VerbatimChar"/>
+        </w:rPr>
+        <w:t xml:space="preserve">    DeriveProd --&gt; ProdOk</w:t>
+      </w:r>
+      <w:r>
+        <w:br/>
+      </w:r>
+      <w:r>
+        <w:rPr>
+          <w:rStyle w:val="VerbatimChar"/>
+        </w:rPr>
+        <w:t xml:space="preserve">    ProdOk -- No --&gt; NotReady[Readiness reason]</w:t>
+      </w:r>
+      <w:r>
+        <w:br/>
+      </w:r>
+      <w:r>
+        <w:rPr>
+          <w:rStyle w:val="VerbatimChar"/>
+        </w:rPr>
+        <w:t xml:space="preserve">    ProdOk -- Yes --&gt; SelectCVAL[Select or validate CVAL]</w:t>
+      </w:r>
+      <w:r>
+        <w:br/>
+      </w:r>
+      <w:r>
+        <w:rPr>
+          <w:rStyle w:val="VerbatimChar"/>
+        </w:rPr>
+        <w:t xml:space="preserve">    SelectCVAL --&gt; SelectDR[Select DR: in-geo, cross-geo Europe for Middle East, or NOT_OFFERED]</w:t>
+      </w:r>
+      <w:r>
+        <w:br/>
+      </w:r>
+      <w:r>
+        <w:rPr>
+          <w:rStyle w:val="VerbatimChar"/>
+        </w:rPr>
+        <w:t xml:space="preserve">    SelectDR --&gt; Fresh{State fresh?}</w:t>
+      </w:r>
+      <w:r>
+        <w:br/>
+      </w:r>
+      <w:r>
+        <w:rPr>
+          <w:rStyle w:val="VerbatimChar"/>
+        </w:rPr>
+        <w:t xml:space="preserve">    Fresh -- No --&gt; Stale[STALE_STATE]</w:t>
+      </w:r>
+      <w:r>
+        <w:br/>
+      </w:r>
+      <w:r>
+        <w:rPr>
+          <w:rStyle w:val="VerbatimChar"/>
+        </w:rPr>
+        <w:t xml:space="preserve">    Fresh -- Yes --&gt; Hold[Create atomic placement hold]</w:t>
+      </w:r>
+      <w:r>
+        <w:br/>
+      </w:r>
+      <w:r>
+        <w:rPr>
+          <w:rStyle w:val="VerbatimChar"/>
+        </w:rPr>
+        <w:t xml:space="preserve">    Hold --&gt; Seed[Write CustomerSeedRecord]</w:t>
+      </w:r>
+      <w:r>
+        <w:br/>
+      </w:r>
+      <w:r>
+        <w:rPr>
+          <w:rStyle w:val="VerbatimChar"/>
+        </w:rPr>
+        <w:t xml:space="preserve">    Reuse --&gt; Readiness[Return DeploymentReadinessResult]</w:t>
+      </w:r>
+      <w:r>
+        <w:br/>
+      </w:r>
+      <w:r>
+        <w:rPr>
+          <w:rStyle w:val="VerbatimChar"/>
+        </w:rPr>
+        <w:t xml:space="preserve">    Seed --&gt; Readiness</w:t>
+      </w:r>
+    </w:p>
+    <w:bookmarkEnd w:id="23"/>
+    <w:bookmarkStart w:id="24" w:name="customerseedrecord"/>
+    <w:p>
+      <w:pPr>
+        <w:pStyle w:val="Heading2"/>
+      </w:pPr>
+      <w:r>
+        <w:t xml:space="preserve">CustomerSeedRecord</w:t>
+      </w:r>
+    </w:p>
+    <w:p>
+      <w:pPr>
+        <w:pStyle w:val="FirstParagraph"/>
+      </w:pPr>
+      <w:r>
+        <w:rPr>
+          <w:rStyle w:val="VerbatimChar"/>
+        </w:rPr>
+        <w:t xml:space="preserve">CustomerSeedRecord</w:t>
+      </w:r>
+      <w:r>
+        <w:t xml:space="preserve"> </w:t>
+      </w:r>
+      <w:r>
+        <w:t xml:space="preserve">must include:</w:t>
       </w:r>
     </w:p>
     <w:p>
       <w:pPr>
         <w:numPr>
           <w:ilvl w:val="0"/>
-          <w:numId w:val="1003"/>
+          <w:numId w:val="1004"/>
         </w:numPr>
         <w:pStyle w:val="Compact"/>
       </w:pPr>
       <w:r>
-        <w:t xml:space="preserve">CVAL region;</w:t>
+        <w:t xml:space="preserve">seed ID and customer/realm identifier;</w:t>
       </w:r>
     </w:p>
     <w:p>
       <w:pPr>
         <w:numPr>
           <w:ilvl w:val="0"/>
-          <w:numId w:val="1003"/>
+          <w:numId w:val="1004"/>
         </w:numPr>
         <w:pStyle w:val="Compact"/>
       </w:pPr>
       <w:r>
-        <w:t xml:space="preserve">DR region or</w:t>
-      </w:r>
-      <w:r>
-        <w:t xml:space="preserve"> </w:t>
-      </w:r>
-      <w:r>
-        <w:rPr>
-          <w:rStyle w:val="VerbatimChar"/>
-        </w:rPr>
-        <w:t xml:space="preserve">NOT_OFFERED</w:t>
-      </w:r>
-      <w:r>
-        <w:t xml:space="preserve">;</w:t>
+        <w:t xml:space="preserve">geography;</w:t>
       </w:r>
     </w:p>
     <w:p>
       <w:pPr>
         <w:numPr>
           <w:ilvl w:val="0"/>
-          <w:numId w:val="1003"/>
+          <w:numId w:val="1004"/>
         </w:numPr>
         <w:pStyle w:val="Compact"/>
       </w:pPr>
       <w:r>
-        <w:t xml:space="preserve">products covered;</w:t>
+        <w:t xml:space="preserve">production region;</w:t>
       </w:r>
     </w:p>
     <w:p>
       <w:pPr>
         <w:numPr>
           <w:ilvl w:val="0"/>
-          <w:numId w:val="1003"/>
+          <w:numId w:val="1004"/>
         </w:numPr>
         <w:pStyle w:val="Compact"/>
       </w:pPr>
       <w:r>
-        <w:t xml:space="preserve">region/zone/SKU-family policy context;</w:t>
+        <w:t xml:space="preserve">CVAL region;</w:t>
       </w:r>
     </w:p>
     <w:p>
       <w:pPr>
         <w:numPr>
           <w:ilvl w:val="0"/>
-          <w:numId w:val="1003"/>
+          <w:numId w:val="1004"/>
         </w:numPr>
         <w:pStyle w:val="Compact"/>
       </w:pPr>
       <w:r>
-        <w:t xml:space="preserve">decision timestamp;</w:t>
+        <w:t xml:space="preserve">DR region or</w:t>
+      </w:r>
+      <w:r>
+        <w:t xml:space="preserve"> </w:t>
+      </w:r>
+      <w:r>
+        <w:rPr>
+          <w:rStyle w:val="VerbatimChar"/>
+        </w:rPr>
+        <w:t xml:space="preserve">NOT_OFFERED</w:t>
+      </w:r>
+      <w:r>
+        <w:t xml:space="preserve">;</w:t>
       </w:r>
     </w:p>
     <w:p>
       <w:pPr>
         <w:numPr>
           <w:ilvl w:val="0"/>
-          <w:numId w:val="1003"/>
+          <w:numId w:val="1004"/>
         </w:numPr>
         <w:pStyle w:val="Compact"/>
       </w:pPr>
       <w:r>
-        <w:t xml:space="preserve">policy version and engine version;</w:t>
+        <w:t xml:space="preserve">products covered;</w:t>
       </w:r>
     </w:p>
     <w:p>
       <w:pPr>
         <w:numPr>
           <w:ilvl w:val="0"/>
-          <w:numId w:val="1003"/>
+          <w:numId w:val="1004"/>
         </w:numPr>
         <w:pStyle w:val="Compact"/>
       </w:pPr>
       <w:r>
-        <w:t xml:space="preserve">capacity/quota snapshot references and freshness;</w:t>
+        <w:t xml:space="preserve">region/zone/SKU-family policy context;</w:t>
       </w:r>
     </w:p>
     <w:p>
       <w:pPr>
         <w:numPr>
           <w:ilvl w:val="0"/>
-          <w:numId w:val="1003"/>
+          <w:numId w:val="1004"/>
         </w:numPr>
         <w:pStyle w:val="Compact"/>
       </w:pPr>
       <w:r>
-        <w:t xml:space="preserve">exception approval reference and customer acknowledgement, where applicable;</w:t>
+        <w:t xml:space="preserve">decision timestamp;</w:t>
       </w:r>
     </w:p>
     <w:p>
       <w:pPr>
         <w:numPr>
           <w:ilvl w:val="0"/>
-          <w:numId w:val="1003"/>
+          <w:numId w:val="1004"/>
         </w:numPr>
         <w:pStyle w:val="Compact"/>
       </w:pPr>
       <w:r>
-        <w:t xml:space="preserve">active hold IDs;</w:t>
+        <w:t xml:space="preserve">policy version and engine version;</w:t>
       </w:r>
     </w:p>
     <w:p>
       <w:pPr>
         <w:numPr>
           <w:ilvl w:val="0"/>
-          <w:numId w:val="1003"/>
+          <w:numId w:val="1004"/>
+        </w:numPr>
+        <w:pStyle w:val="Compact"/>
+      </w:pPr>
+      <w:r>
+        <w:t xml:space="preserve">capacity/quota snapshot references and freshness;</w:t>
+      </w:r>
+    </w:p>
+    <w:p>
+      <w:pPr>
+        <w:numPr>
+          <w:ilvl w:val="0"/>
+          <w:numId w:val="1004"/>
+        </w:numPr>
+        <w:pStyle w:val="Compact"/>
+      </w:pPr>
+      <w:r>
+        <w:t xml:space="preserve">exception approval reference and customer acknowledgement, where applicable;</w:t>
+      </w:r>
+    </w:p>
+    <w:p>
+      <w:pPr>
+        <w:numPr>
+          <w:ilvl w:val="0"/>
+          <w:numId w:val="1004"/>
+        </w:numPr>
+        <w:pStyle w:val="Compact"/>
+      </w:pPr>
+      <w:r>
+        <w:t xml:space="preserve">active hold IDs;</w:t>
+      </w:r>
+    </w:p>
+    <w:p>
+      <w:pPr>
+        <w:numPr>
+          <w:ilvl w:val="0"/>
+          <w:numId w:val="1004"/>
         </w:numPr>
         <w:pStyle w:val="Compact"/>
       </w:pPr>
@@ -2225,6 +2450,16 @@
             <w:r>
               <w:t xml:space="preserve">Region-model gate (geography-aware)</w:t>
             </w:r>
+            <w:r>
+              <w:t xml:space="preserve"> </w:t>
+            </w:r>
+            <w:r>
+              <w:rPr>
+                <w:bCs/>
+                <w:b/>
+              </w:rPr>
+              <w:t xml:space="preserve">[Amended v2.4]</w:t>
+            </w:r>
           </w:p>
         </w:tc>
         <w:tc>
@@ -2277,13 +2512,13 @@
                 <w:bCs/>
                 <w:b/>
               </w:rPr>
-              <w:t xml:space="preserve">two-region</w:t>
+              <w:t xml:space="preserve">two-region co-located</w:t>
             </w:r>
             <w:r>
               <w:t xml:space="preserve"> </w:t>
             </w:r>
             <w:r>
-              <w:t xml:space="preserve">geography requires Prod in one region and</w:t>
+              <w:t xml:space="preserve">geography (EU, Australia, Asia Pacific) requires Prod in one region and</w:t>
             </w:r>
             <w:r>
               <w:t xml:space="preserve"> </w:t>
@@ -2306,15 +2541,16 @@
             </w:r>
             <w:r>
               <w:rPr>
-                <w:rStyle w:val="VerbatimChar"/>
+                <w:bCs/>
+                <w:b/>
               </w:rPr>
-              <w:t xml:space="preserve">DR_NOT_OFFERED</w:t>
+              <w:t xml:space="preserve">cross-geo DR</w:t>
             </w:r>
             <w:r>
               <w:t xml:space="preserve"> </w:t>
             </w:r>
             <w:r>
-              <w:t xml:space="preserve">geography (Middle East, DEC-001) requires Prod + CVAL only, with no DR region. A universal</w:t>
+              <w:t xml:space="preserve">geography (Middle East) requires Prod + CVAL co-located in a Middle East region and DR in a weighted-selected Europe region (DR-020, PLC-010b). A universal</w:t>
             </w:r>
             <w:r>
               <w:t xml:space="preserve"> </w:t>
@@ -2574,7 +2810,7 @@
       <w:pPr>
         <w:numPr>
           <w:ilvl w:val="0"/>
-          <w:numId w:val="1004"/>
+          <w:numId w:val="1005"/>
         </w:numPr>
         <w:pStyle w:val="Compact"/>
       </w:pPr>
@@ -2589,81 +2825,6 @@
           <w:rStyle w:val="VerbatimChar"/>
         </w:rPr>
         <w:t xml:space="preserve">[Derived]</w:t>
-      </w:r>
-    </w:p>
-    <w:p>
-      <w:pPr>
-        <w:numPr>
-          <w:ilvl w:val="0"/>
-          <w:numId w:val="1004"/>
-        </w:numPr>
-        <w:pStyle w:val="Compact"/>
-      </w:pPr>
-      <w:r>
-        <w:t xml:space="preserve">Produces stable placement across products for the same customer/geography.</w:t>
-      </w:r>
-      <w:r>
-        <w:t xml:space="preserve"> </w:t>
-      </w:r>
-      <w:r>
-        <w:rPr>
-          <w:rStyle w:val="VerbatimChar"/>
-        </w:rPr>
-        <w:t xml:space="preserve">[Decided]</w:t>
-      </w:r>
-    </w:p>
-    <w:p>
-      <w:pPr>
-        <w:numPr>
-          <w:ilvl w:val="0"/>
-          <w:numId w:val="1004"/>
-        </w:numPr>
-        <w:pStyle w:val="Compact"/>
-      </w:pPr>
-      <w:r>
-        <w:t xml:space="preserve">Makes CVAL/DR decisions replayable from seed, policy version, and snapshot references.</w:t>
-      </w:r>
-      <w:r>
-        <w:t xml:space="preserve"> </w:t>
-      </w:r>
-      <w:r>
-        <w:rPr>
-          <w:rStyle w:val="VerbatimChar"/>
-        </w:rPr>
-        <w:t xml:space="preserve">[Decided]</w:t>
-      </w:r>
-    </w:p>
-    <w:p>
-      <w:pPr>
-        <w:numPr>
-          <w:ilvl w:val="0"/>
-          <w:numId w:val="1004"/>
-        </w:numPr>
-        <w:pStyle w:val="Compact"/>
-      </w:pPr>
-      <w:r>
-        <w:t xml:space="preserve">Gives AEP/provisioning an explicit readiness contract instead of implicit success/failure.</w:t>
-      </w:r>
-      <w:r>
-        <w:t xml:space="preserve"> </w:t>
-      </w:r>
-      <w:r>
-        <w:rPr>
-          <w:rStyle w:val="VerbatimChar"/>
-        </w:rPr>
-        <w:t xml:space="preserve">[Decided]</w:t>
-      </w:r>
-    </w:p>
-    <w:p>
-      <w:pPr>
-        <w:pStyle w:val="FirstParagraph"/>
-      </w:pPr>
-      <w:r>
-        <w:rPr>
-          <w:bCs/>
-          <w:b/>
-        </w:rPr>
-        <w:t xml:space="preserve">Negative / trade-offs</w:t>
       </w:r>
     </w:p>
     <w:p>
@@ -2675,7 +2836,7 @@
         <w:pStyle w:val="Compact"/>
       </w:pPr>
       <w:r>
-        <w:t xml:space="preserve">Geography-only onboarding now needs exception governance and customer acknowledgement.</w:t>
+        <w:t xml:space="preserve">Produces stable placement across products for the same customer/geography.</w:t>
       </w:r>
       <w:r>
         <w:t xml:space="preserve"> </w:t>
@@ -2696,16 +2857,16 @@
         <w:pStyle w:val="Compact"/>
       </w:pPr>
       <w:r>
-        <w:t xml:space="preserve">Seed migration becomes a governed workflow, not a simple re-run of scoring.</w:t>
-      </w:r>
-      <w:r>
-        <w:t xml:space="preserve"> </w:t>
-      </w:r>
-      <w:r>
-        <w:rPr>
-          <w:rStyle w:val="VerbatimChar"/>
-        </w:rPr>
-        <w:t xml:space="preserve">[Derived]</w:t>
+        <w:t xml:space="preserve">Makes CVAL/DR decisions replayable from seed, policy version, and snapshot references.</w:t>
+      </w:r>
+      <w:r>
+        <w:t xml:space="preserve"> </w:t>
+      </w:r>
+      <w:r>
+        <w:rPr>
+          <w:rStyle w:val="VerbatimChar"/>
+        </w:rPr>
+        <w:t xml:space="preserve">[Decided]</w:t>
       </w:r>
     </w:p>
     <w:p>
@@ -2717,32 +2878,138 @@
         <w:pStyle w:val="Compact"/>
       </w:pPr>
       <w:r>
-        <w:rPr>
-          <w:rStyle w:val="VerbatimChar"/>
-        </w:rPr>
-        <w:t xml:space="preserve">DR_NOT_OFFERED</w:t>
-      </w:r>
-      <w:r>
-        <w:t xml:space="preserve"> </w:t>
-      </w:r>
-      <w:r>
-        <w:t xml:space="preserve">can create a readiness-with-risk outcome that must be handled commercially and operationally.</w:t>
-      </w:r>
-      <w:r>
-        <w:t xml:space="preserve"> </w:t>
-      </w:r>
-      <w:r>
-        <w:rPr>
-          <w:rStyle w:val="VerbatimChar"/>
-        </w:rPr>
-        <w:t xml:space="preserve">[Derived]</w:t>
+        <w:t xml:space="preserve">Gives AEP/provisioning an explicit readiness contract instead of implicit success/failure.</w:t>
+      </w:r>
+      <w:r>
+        <w:t xml:space="preserve"> </w:t>
+      </w:r>
+      <w:r>
+        <w:rPr>
+          <w:rStyle w:val="VerbatimChar"/>
+        </w:rPr>
+        <w:t xml:space="preserve">[Decided]</w:t>
+      </w:r>
+    </w:p>
+    <w:p>
+      <w:pPr>
+        <w:pStyle w:val="FirstParagraph"/>
+      </w:pPr>
+      <w:r>
+        <w:rPr>
+          <w:bCs/>
+          <w:b/>
+        </w:rPr>
+        <w:t xml:space="preserve">Negative / trade-offs</w:t>
       </w:r>
     </w:p>
     <w:p>
       <w:pPr>
         <w:numPr>
           <w:ilvl w:val="0"/>
-          <w:numId w:val="1005"/>
+          <w:numId w:val="1006"/>
+        </w:numPr>
+        <w:pStyle w:val="Compact"/>
+      </w:pPr>
+      <w:r>
+        <w:t xml:space="preserve">Geography-only onboarding now needs exception governance and customer acknowledgement.</w:t>
+      </w:r>
+      <w:r>
+        <w:t xml:space="preserve"> </w:t>
+      </w:r>
+      <w:r>
+        <w:rPr>
+          <w:rStyle w:val="VerbatimChar"/>
+        </w:rPr>
+        <w:t xml:space="preserve">[Decided]</w:t>
+      </w:r>
+    </w:p>
+    <w:p>
+      <w:pPr>
+        <w:numPr>
+          <w:ilvl w:val="0"/>
+          <w:numId w:val="1006"/>
+        </w:numPr>
+        <w:pStyle w:val="Compact"/>
+      </w:pPr>
+      <w:r>
+        <w:t xml:space="preserve">Seed migration becomes a governed workflow, not a simple re-run of scoring.</w:t>
+      </w:r>
+      <w:r>
+        <w:t xml:space="preserve"> </w:t>
+      </w:r>
+      <w:r>
+        <w:rPr>
+          <w:rStyle w:val="VerbatimChar"/>
+        </w:rPr>
+        <w:t xml:space="preserve">[Derived]</w:t>
+      </w:r>
+    </w:p>
+    <w:p>
+      <w:pPr>
+        <w:numPr>
+          <w:ilvl w:val="0"/>
+          <w:numId w:val="1006"/>
+        </w:numPr>
+        <w:pStyle w:val="Compact"/>
+      </w:pPr>
+      <w:r>
+        <w:rPr>
+          <w:rStyle w:val="VerbatimChar"/>
+        </w:rPr>
+        <w:t xml:space="preserve">DR_NOT_OFFERED</w:t>
+      </w:r>
+      <w:r>
+        <w:t xml:space="preserve"> </w:t>
+      </w:r>
+      <w:r>
+        <w:t xml:space="preserve">can create a readiness-with-risk outcome that must be handled commercially and operationally.</w:t>
+      </w:r>
+      <w:r>
+        <w:t xml:space="preserve"> </w:t>
+      </w:r>
+      <w:r>
+        <w:rPr>
+          <w:rStyle w:val="VerbatimChar"/>
+        </w:rPr>
+        <w:t xml:space="preserve">[Derived]</w:t>
+      </w:r>
+    </w:p>
+    <w:p>
+      <w:pPr>
+        <w:numPr>
+          <w:ilvl w:val="0"/>
+          <w:numId w:val="1006"/>
+        </w:numPr>
+        <w:pStyle w:val="Compact"/>
+      </w:pPr>
+      <w:r>
+        <w:rPr>
+          <w:bCs/>
+          <w:b/>
+        </w:rPr>
+        <w:t xml:space="preserve">[Amended v2.4]</w:t>
+      </w:r>
+      <w:r>
+        <w:t xml:space="preserve"> </w:t>
+      </w:r>
+      <w:r>
+        <w:t xml:space="preserve">Cross-geo DR for the Middle East adds a cross-geography dependency: Europe Standard regions now absorb Middle East DR load, and both the Middle East (Prod+CVAL) and Europe (DR) legs must be weighted-selected and held atomically. Data residency of the DR copy is governed by A-ME1 and must be re-validated if Legal changes the approved destination.</w:t>
+      </w:r>
+      <w:r>
+        <w:t xml:space="preserve"> </w:t>
+      </w:r>
+      <w:r>
+        <w:rPr>
+          <w:rStyle w:val="VerbatimChar"/>
+        </w:rPr>
+        <w:t xml:space="preserve">[Derived]</w:t>
+      </w:r>
+    </w:p>
+    <w:p>
+      <w:pPr>
+        <w:numPr>
+          <w:ilvl w:val="0"/>
+          <w:numId w:val="1006"/>
         </w:numPr>
         <w:pStyle w:val="Compact"/>
       </w:pPr>
@@ -2922,19 +3189,67 @@
               <w:jc w:val="left"/>
             </w:pPr>
             <w:r>
-              <w:t xml:space="preserve">Auto-select cross-geo DR for two-region geographies</w:t>
-            </w:r>
-          </w:p>
-        </w:tc>
-        <w:tc>
-          <w:tcPr/>
-          <w:p>
-            <w:pPr>
-              <w:pStyle w:val="Compact"/>
-              <w:jc w:val="left"/>
-            </w:pPr>
-            <w:r>
-              <w:t xml:space="preserve">Rejected. Two-region geographies co-locate CVAL and DR in-geo (PLC-010a); cross-geo substitution is never silent. Where in-geo DR is legally impossible (Middle East), the seed is</w:t>
+              <w:t xml:space="preserve">Auto-select cross-geo DR for two-region co-located geographies</w:t>
+            </w:r>
+          </w:p>
+        </w:tc>
+        <w:tc>
+          <w:tcPr/>
+          <w:p>
+            <w:pPr>
+              <w:pStyle w:val="Compact"/>
+              <w:jc w:val="left"/>
+            </w:pPr>
+            <w:r>
+              <w:t xml:space="preserve">Rejected. EU, Australia and Asia Pacific co-locate CVAL and DR in-geo (PLC-010a); cross-geo substitution is never silent for them.</w:t>
+            </w:r>
+            <w:r>
+              <w:t xml:space="preserve"> </w:t>
+            </w:r>
+            <w:r>
+              <w:rPr>
+                <w:bCs/>
+                <w:b/>
+              </w:rPr>
+              <w:t xml:space="preserve">[Amended v2.4]</w:t>
+            </w:r>
+            <w:r>
+              <w:t xml:space="preserve"> </w:t>
+            </w:r>
+            <w:r>
+              <w:t xml:space="preserve">Cross-geo DR is now the</w:t>
+            </w:r>
+            <w:r>
+              <w:t xml:space="preserve"> </w:t>
+            </w:r>
+            <w:r>
+              <w:rPr>
+                <w:bCs/>
+                <w:b/>
+              </w:rPr>
+              <w:t xml:space="preserve">explicit, catalogued</w:t>
+            </w:r>
+            <w:r>
+              <w:t xml:space="preserve"> </w:t>
+            </w:r>
+            <w:r>
+              <w:t xml:space="preserve">distribution model for the Middle East only (DR-020, PLC-010b): DR is weighted-selected among</w:t>
+            </w:r>
+            <w:r>
+              <w:t xml:space="preserve"> </w:t>
+            </w:r>
+            <w:r>
+              <w:rPr>
+                <w:bCs/>
+                <w:b/>
+              </w:rPr>
+              <w:t xml:space="preserve">Europe Standard regions</w:t>
+            </w:r>
+            <w:r>
+              <w:t xml:space="preserve"> </w:t>
+            </w:r>
+            <w:r>
+              <w:t xml:space="preserve">(not a single fixed region such as the former Switzerland North example), and the former</w:t>
             </w:r>
             <w:r>
               <w:t xml:space="preserve"> </w:t>
@@ -2946,7 +3261,74 @@
               <w:t xml:space="preserve">DR_NOT_OFFERED</w:t>
             </w:r>
             <w:r>
-              <w:t xml:space="preserve">, and any cross-geo path (Switzerland North) is explicit and approval-gated.</w:t>
+              <w:t xml:space="preserve"> </w:t>
+            </w:r>
+            <w:r>
+              <w:t xml:space="preserve">seed is superseded.</w:t>
+            </w:r>
+            <w:r>
+              <w:t xml:space="preserve"> </w:t>
+            </w:r>
+            <w:r>
+              <w:rPr>
+                <w:rStyle w:val="VerbatimChar"/>
+              </w:rPr>
+              <w:t xml:space="preserve">[Decided]</w:t>
+            </w:r>
+          </w:p>
+        </w:tc>
+      </w:tr>
+      <w:tr>
+        <w:tc>
+          <w:tcPr/>
+          <w:p>
+            <w:pPr>
+              <w:pStyle w:val="Compact"/>
+              <w:jc w:val="left"/>
+            </w:pPr>
+            <w:r>
+              <w:t xml:space="preserve">Fix a single Europe region (e.g. Switzerland North) for Middle East cross-geo DR</w:t>
+            </w:r>
+          </w:p>
+        </w:tc>
+        <w:tc>
+          <w:tcPr/>
+          <w:p>
+            <w:pPr>
+              <w:pStyle w:val="Compact"/>
+              <w:jc w:val="left"/>
+            </w:pPr>
+            <w:r>
+              <w:t xml:space="preserve">Rejected</w:t>
+            </w:r>
+            <w:r>
+              <w:t xml:space="preserve"> </w:t>
+            </w:r>
+            <w:r>
+              <w:rPr>
+                <w:bCs/>
+                <w:b/>
+              </w:rPr>
+              <w:t xml:space="preserve">[Amended v2.4]</w:t>
+            </w:r>
+            <w:r>
+              <w:t xml:space="preserve">. Baseline v2.4 requires the Europe DR region to be chosen through the</w:t>
+            </w:r>
+            <w:r>
+              <w:t xml:space="preserve"> </w:t>
+            </w:r>
+            <w:r>
+              <w:rPr>
+                <w:bCs/>
+                <w:b/>
+              </w:rPr>
+              <w:t xml:space="preserve">weighted capacity placement model</w:t>
+            </w:r>
+            <w:r>
+              <w:t xml:space="preserve"> </w:t>
+            </w:r>
+            <w:r>
+              <w:t xml:space="preserve">among Europe Standard regions so DR placement reflects live capacity/quota, not a hard-coded region. Switzerland North remains only a default example.</w:t>
             </w:r>
             <w:r>
               <w:t xml:space="preserve"> </w:t>
@@ -3051,19 +3433,71 @@
               <w:jc w:val="left"/>
             </w:pPr>
             <w:r>
-              <w:t xml:space="preserve">REG-001..005, PLC-001..010a, RDY-001..004, DR-014</w:t>
-            </w:r>
-          </w:p>
-        </w:tc>
-        <w:tc>
-          <w:tcPr/>
-          <w:p>
-            <w:pPr>
-              <w:pStyle w:val="Compact"/>
-              <w:jc w:val="left"/>
-            </w:pPr>
-            <w:r>
-              <w:t xml:space="preserve">DEC-001 Middle East/no-DR policy; DEC-003 geography exception approver; production stale-state threshold</w:t>
+              <w:t xml:space="preserve">REG-001..005, PLC-001..010a,</w:t>
+            </w:r>
+            <w:r>
+              <w:t xml:space="preserve"> </w:t>
+            </w:r>
+            <w:r>
+              <w:rPr>
+                <w:bCs/>
+                <w:b/>
+              </w:rPr>
+              <w:t xml:space="preserve">PLC-010b</w:t>
+            </w:r>
+            <w:r>
+              <w:t xml:space="preserve">, RDY-001..004, DR-014,</w:t>
+            </w:r>
+            <w:r>
+              <w:t xml:space="preserve"> </w:t>
+            </w:r>
+            <w:r>
+              <w:rPr>
+                <w:bCs/>
+                <w:b/>
+              </w:rPr>
+              <w:t xml:space="preserve">DR-020</w:t>
+            </w:r>
+            <w:r>
+              <w:t xml:space="preserve">,</w:t>
+            </w:r>
+            <w:r>
+              <w:t xml:space="preserve"> </w:t>
+            </w:r>
+            <w:r>
+              <w:rPr>
+                <w:bCs/>
+                <w:b/>
+              </w:rPr>
+              <w:t xml:space="preserve">A-ME1</w:t>
+            </w:r>
+          </w:p>
+        </w:tc>
+        <w:tc>
+          <w:tcPr/>
+          <w:p>
+            <w:pPr>
+              <w:pStyle w:val="Compact"/>
+              <w:jc w:val="left"/>
+            </w:pPr>
+            <w:r>
+              <w:rPr>
+                <w:strike/>
+              </w:rPr>
+              <w:t xml:space="preserve">DEC-001</w:t>
+            </w:r>
+            <w:r>
+              <w:t xml:space="preserve"> </w:t>
+            </w:r>
+            <w:r>
+              <w:rPr>
+                <w:bCs/>
+                <w:b/>
+              </w:rPr>
+              <w:t xml:space="preserve">RESOLVED — Middle East DR now offered (cross-geo to Europe, v2.4 amended)</w:t>
+            </w:r>
+            <w:r>
+              <w:t xml:space="preserve">; DEC-003 geography exception approver; production stale-state threshold; per-country ME data-residency carve-outs (Legal)</w:t>
             </w:r>
           </w:p>
         </w:tc>
@@ -3419,7 +3853,7 @@
       <w:pPr>
         <w:numPr>
           <w:ilvl w:val="0"/>
-          <w:numId w:val="1006"/>
+          <w:numId w:val="1007"/>
         </w:numPr>
         <w:pStyle w:val="Compact"/>
       </w:pPr>
@@ -3450,7 +3884,7 @@
       <w:pPr>
         <w:numPr>
           <w:ilvl w:val="0"/>
-          <w:numId w:val="1006"/>
+          <w:numId w:val="1007"/>
         </w:numPr>
         <w:pStyle w:val="Compact"/>
       </w:pPr>
@@ -3481,7 +3915,7 @@
       <w:pPr>
         <w:numPr>
           <w:ilvl w:val="0"/>
-          <w:numId w:val="1006"/>
+          <w:numId w:val="1007"/>
         </w:numPr>
         <w:pStyle w:val="Compact"/>
       </w:pPr>
@@ -3546,7 +3980,7 @@
         <w:t xml:space="preserve"> </w:t>
       </w:r>
       <w:r>
-        <w:t xml:space="preserve">After DEC-001/DEC-003 decisions, readiness API contract review, and first seed-record implementation test.</w:t>
+        <w:t xml:space="preserve">After DEC-003 decision, readiness API contract review, and first seed-record implementation test. (DEC-001 resolved — Middle East DR now offered as cross-geo DR to Europe, v2.4 amended 11 Sep 2026.)</w:t>
       </w:r>
     </w:p>
     <w:bookmarkEnd w:id="31"/>
@@ -3855,7 +4289,34 @@
     </w:lvlOverride>
   </w:num>
   <w:num w:numId="1003">
-    <w:abstractNumId w:val="991"/>
+    <w:abstractNumId w:val="99411"/>
+    <w:lvlOverride w:ilvl="0">
+      <w:startOverride w:val="1"/>
+    </w:lvlOverride>
+    <w:lvlOverride w:ilvl="1">
+      <w:startOverride w:val="1"/>
+    </w:lvlOverride>
+    <w:lvlOverride w:ilvl="2">
+      <w:startOverride w:val="1"/>
+    </w:lvlOverride>
+    <w:lvlOverride w:ilvl="3">
+      <w:startOverride w:val="1"/>
+    </w:lvlOverride>
+    <w:lvlOverride w:ilvl="4">
+      <w:startOverride w:val="1"/>
+    </w:lvlOverride>
+    <w:lvlOverride w:ilvl="5">
+      <w:startOverride w:val="1"/>
+    </w:lvlOverride>
+    <w:lvlOverride w:ilvl="6">
+      <w:startOverride w:val="1"/>
+    </w:lvlOverride>
+    <w:lvlOverride w:ilvl="7">
+      <w:startOverride w:val="1"/>
+    </w:lvlOverride>
+    <w:lvlOverride w:ilvl="8">
+      <w:startOverride w:val="1"/>
+    </w:lvlOverride>
   </w:num>
   <w:num w:numId="1004">
     <w:abstractNumId w:val="991"/>
@@ -3864,6 +4325,9 @@
     <w:abstractNumId w:val="991"/>
   </w:num>
   <w:num w:numId="1006">
+    <w:abstractNumId w:val="991"/>
+  </w:num>
+  <w:num w:numId="1007">
     <w:abstractNumId w:val="991"/>
   </w:num>
 </w:numbering>

</xml_diff>